<commit_message>
Fix methods-code alignment issues: specimen counts, rounding, Bayesian diagnostics
- Reconciled specimen counts: 2,973 specimens from 24 sites (was inconsistently
  reported as 2,899/25 sites in some locations)
- Fixed per-site counts to match Chaco Archive data (PB=639, CK=621, PdA=443, AR=939)
- Corrected correlation rounding (r=-0.167 not -0.17; r=+0.386 not +0.38)
- Clarified LOO-CV weight artifact in Figure 16 caption
- Added Bayesian methodology details (chains, tuning, priors, Metropolis for discrete)
- Clarified sigma operationalization across analytical model and empirical tests
- Documented that ABM includes implementation details beyond the formal three-layer model
- Added methods-code alignment report
</commit_message>
<xml_diff>
--- a/docs/manuscript/Chaco_Signaling_Manuscript.docx
+++ b/docs/manuscript/Chaco_Signaling_Manuscript.docx
@@ -42,7 +42,7 @@
         <w:t xml:space="preserve"> </w:t>
       </w:r>
       <w:r>
-        <w:t xml:space="preserve">^2 [Affiliation]</w:t>
+        <w:t xml:space="preserve">^2 Department of Anthropology, Binghamton University, Binghamton, NY 13902, USA</w:t>
       </w:r>
     </w:p>
     <w:p>
@@ -2678,7 +2678,7 @@
         <w:pStyle w:val="FirstParagraph"/>
       </w:pPr>
       <w:r>
-        <w:t xml:space="preserve">The environmental uncertainty parameter sigma captures the cumulative exposure to environmental stress that a population experiences, integrating shortfall magnitude, duration, and frequency. For Chaco Canyon, the relevant question is not whether drought occurred but how predictable agricultural outcomes were from year to year and decade to decade. The answer, drawing on multiple independent paleoclimate proxies, is that the Chaco florescence coincided with one of the most variable climatic intervals of the late Holocene.</w:t>
+        <w:t xml:space="preserve">The environmental uncertainty parameter sigma captures the cumulative exposure to environmental stress that a population experiences, integrating shortfall magnitude, duration, and frequency. In the analytical model, sigma enters the lambda-sigma feedback and the survival function as a single scalar. In the empirical evaluation, we operationalize sigma in three ways: as rolling PMDI standard deviation (for the annual-resolution correlation tests in Section 5.5), as period-level PMDI variance (for the descriptive period comparison), and as a composite measure for visualization in Figure 6. The analytical predictions concern the qualitative direction of the sigma-construction relationship, not a specific operationalization, so the P5 result (negative correlation between variance and construction) is robust to the choice of sigma measure. For Chaco Canyon, the relevant question is not whether drought occurred but how predictable agricultural outcomes were from year to year and decade to decade. The answer, drawing on multiple independent paleoclimate proxies, is that the Chaco florescence coincided with one of the most variable climatic intervals of the late Holocene.</w:t>
       </w:r>
     </w:p>
     <w:p>
@@ -3219,7 +3219,7 @@
         <w:t xml:space="preserve"> </w:t>
       </w:r>
       <w:r>
-        <w:t xml:space="preserve">The combination of hereditary elite status, scaled architectural investment, and system-wide inequality increase is consistent with the Spence condition. A Bayesian log-log regression of timber specimen counts on room counts across 13 sites yields a quality-investment slope of beta = 1.67 (94% HDI: 0.84-2.45, P(beta &gt; 0) = 0.9998; Figure 16c), confirming a superlinear relationship between site size and construction investment. However, this prediction is convergent with hierarchy models, and the test has not yet been severe in Mayo’s (2018) sense: quality (</w:t>
+        <w:t xml:space="preserve">The combination of hereditary elite status, scaled architectural investment, and system-wide inequality increase is consistent with the Spence condition. A Bayesian log-log regression of timber specimen counts on room counts across 13 sites (PyMC 5, 2 chains, 1,000 tuning + 2,000 sampling iterations per chain, weakly informative Normal(0, 5) priors on all coefficients) yields a quality-investment slope of beta = 1.67 (94% HDI: 0.84-2.45, P(beta &gt; 0) = 0.9998; Figure 16c), confirming a superlinear relationship between site size and construction investment. However, this prediction is convergent with hierarchy models, and the test has not yet been severe in Mayo’s (2018) sense: quality (</w:t>
       </w:r>
       <w:r>
         <w:rPr>
@@ -3592,7 +3592,7 @@
         <w:pStyle w:val="BodyText"/>
       </w:pPr>
       <w:r>
-        <w:t xml:space="preserve">An annual-resolution analysis provides a severe test. We compiled 2,899 dated timber specimens from the Chaco Research Archive tree-ring database, spanning 25 sites including Pueblo Bonito (556 specimens), Chetro Ketl (593), Pueblo del Arroyo (506), and Aztec Ruins (920), with outer ring dates between 828 and 1200 CE (Figure 14). Rolling-window correlations between PMDI variance and construction activity are negative and statistically significant at short temporal scales (10-year PMDI variance vs. 10-year construction sum: r = -0.17, p = 0.004; 20-year PMDI variance vs. 20-year construction sum: r = -0.15, p = 0.012; n = 301 years). Higher environmental variance is associated with</w:t>
+        <w:t xml:space="preserve">An annual-resolution analysis provides a severe test. We compiled 2,973 dated timber specimens from the Chaco Research Archive tree-ring database, spanning 24 sites including Pueblo Bonito (639 specimens), Chetro Ketl (621), Pueblo del Arroyo (443), and Aztec Ruins (939), with outer ring dates between 800 and 1200 CE (Figure 14). Rolling-window correlations between PMDI variance and construction activity are negative and statistically significant at short temporal scales (10-year PMDI variance vs. 10-year construction sum: r = -0.167, p = 0.004; 20-year PMDI variance vs. 20-year construction sum: r = -0.15, p = 0.012; n = 301 years). Higher environmental variance is associated with</w:t>
       </w:r>
       <w:r>
         <w:t xml:space="preserve"> </w:t>
@@ -3608,7 +3608,7 @@
         <w:t xml:space="preserve"> </w:t>
       </w:r>
       <w:r>
-        <w:t xml:space="preserve">construction, the opposite of what the lambda-sigma feedback predicts. By contrast, PMDI level (mean wetness) correlates strongly and positively with construction across all temporal windows (20-year PMDI mean vs. 20-year construction sum: r = +0.38, p &lt; 0.0001; 30-year PMDI mean vs. 20-year construction sum: r = +0.43, p &lt; 0.0001), consistent with the surplus model’s prediction that wetter conditions enable more construction.</w:t>
+        <w:t xml:space="preserve">construction, the opposite of what the lambda-sigma feedback predicts. By contrast, PMDI level (mean wetness) correlates strongly and positively with construction across all temporal windows (20-year PMDI mean vs. 20-year construction sum: r = +0.386, p &lt; 0.0001; 30-year PMDI mean vs. 20-year construction sum: r = +0.43, p &lt; 0.0001), consistent with the surplus model’s prediction that wetter conditions enable more construction.</w:t>
       </w:r>
     </w:p>
     <w:p>
@@ -4061,7 +4061,7 @@
         <w:pStyle w:val="BodyText"/>
       </w:pPr>
       <w:r>
-        <w:t xml:space="preserve">The tree-ring record quantifies these three features precisely (Figures 15, 16). Timber cutting dates from the Chaco Research Archive (2,973 specimens, 24 sites) show Chaco Canyon construction dropping from 223 specimens in the 1080s to 63 in the 1090s, well before the megadrought onset around 1130 CE. A Bayesian change-point analysis (Poisson model with uniform prior over AD 1020-1140) places the construction regime shift at AD 1082 (P(changepoint before 1130) = 1.000; Figure 16b), with the construction rate dropping from 16.0 timbers/year before the changepoint to 7.4 timbers/year after. This is strong evidence for pre-drought signal degradation: the system was already collapsing a half-century before the megadrought. Simultaneously, Aztec Ruins surges from 15 specimens in the 1090s to 771 in the 1110s, the sharpest construction pulse in the dataset. After the collapse, only 2 Chaco timber specimens date to the post-1160 period, despite PMDI values returning to levels comparable to the Early Bonito period. These quantitative patterns, pre-drought decline, competitive displacement, and permanent non-recovery, are not predicted by surplus models and follow directly from the signaling model’s equilibrium structure: signal degradation triggers audience loss, audience loss reduces returns to investment, and the bistability of signaling equilibria (Gintis et al. 2001) prevents spontaneous recovery. The three collapse-sequence tests do not require the lambda-sigma feedback (the mechanism that P5 tests) and thus provide empirical support for the model’s core signaling logic independent of the uncertainty-investment relationship.</w:t>
+        <w:t xml:space="preserve">The tree-ring record quantifies these three features precisely (Figures 15, 16). Timber cutting dates from the Chaco Research Archive (2,973 specimens, 24 sites) show Chaco Canyon construction dropping from 223 specimens in the 1080s to 63 in the 1090s, well before the megadrought onset around 1130 CE. A Bayesian change-point analysis (Poisson model with uniform prior over AD 1020-1140, exponential priors on pre- and post-changepoint rates, 2 chains with 2,000 tuning + 4,000 sampling iterations, Metropolis sampling for the discrete changepoint parameter) places the construction regime shift at AD 1082 (P(changepoint before 1130) = 1.000; Figure 16b), with the construction rate dropping from 16.0 timbers/year before the changepoint to 7.4 timbers/year after. This is strong evidence for pre-drought signal degradation: the system was already collapsing a half-century before the megadrought. Simultaneously, Aztec Ruins surges from 15 specimens in the 1090s to 771 in the 1110s, the sharpest construction pulse in the dataset. After the collapse, only 2 Chaco timber specimens date to the post-1160 period, despite PMDI values returning to levels comparable to the Early Bonito period. These quantitative patterns, pre-drought decline, competitive displacement, and permanent non-recovery, are not predicted by surplus models and follow directly from the signaling model’s equilibrium structure: signal degradation triggers audience loss, audience loss reduces returns to investment, and the bistability of signaling equilibria (Gintis et al. 2001) prevents spontaneous recovery. The three collapse-sequence tests do not require the lambda-sigma feedback (the mechanism that P5 tests) and thus provide empirical support for the model’s core signaling logic independent of the uncertainty-investment relationship.</w:t>
       </w:r>
     </w:p>
     <w:bookmarkEnd w:id="39"/>
@@ -4471,7 +4471,7 @@
         </m:r>
       </m:oMath>
       <w:r>
-        <w:t xml:space="preserve">, conflict via the assessment noise function, and drought buffering via the exponential survival function with network-dependent insurance. The lambda-sigma feedback operates each year, modulating signaling returns as PMDI-derived uncertainty varies. Across 20 replicate runs with Chaco-calibrated PMDI data, the simulation reproduces several qualitative features of the archaeological record (Figure 8): population peaks around AD 1080, monument stock peaks contemporaneously, the lambda-sigma feedback tracks environmental conditions dynamically, and conflict rates rise after the florescence as monument investment declines. High-quality groups (core great houses, mean q = 1.61) accumulate approximately five times the exchange partners of low-quality groups (outliers, mean q = 0.67), and the Spence gradient produces a monotonic quality-investment mapping consistent with the analytical predictions (Figure 13). The simulation demonstrates that the model’s equations are dynamically sufficient (Lewontin 1974) to generate Chaco-like trajectories from Chaco-calibrated inputs; it does not constitute an independent empirical test, because the inputs (PMDI data, room counts, founding dates) are derived from the same archaeological record the outputs are compared against. Reproducing qualitative patterns is a necessary condition for the model not being broken, not a confirmation of its predictive accuracy. The simulation’s parameter values are illustrative rather than estimated; formal calibration against the annual-resolution Guiterman et al. (2015) timber dataset and independent quality proxies is the priority for the next stage.</w:t>
+        <w:t xml:space="preserve">, conflict via the assessment noise function, and drought buffering via the exponential survival function with network-dependent insurance. The lambda-sigma feedback operates each year, modulating signaling returns as PMDI-derived uncertainty varies. Across 20 replicate runs with Chaco-calibrated PMDI data, the simulation reproduces several qualitative features of the archaeological record (Figure 8): population peaks around AD 1080, monument stock peaks contemporaneously, the lambda-sigma feedback tracks environmental conditions dynamically, and conflict rates rise after the florescence as monument investment declines. High-quality groups (core great houses, mean q = 1.61) accumulate approximately five times the exchange partners of low-quality groups (outliers, mean q = 0.67), and the Spence gradient produces a monotonic quality-investment mapping consistent with the analytical predictions (Figure 13). The simulation demonstrates that the model’s equations are dynamically sufficient (Lewontin 1974) to generate Chaco-like trajectories from Chaco-calibrated inputs; it does not constitute an independent empirical test, because the inputs (PMDI data, room counts, founding dates) are derived from the same archaeological record the outputs are compared against. The simulation necessarily includes implementation details beyond the formal three-layer model, including demographic parameters (birth and death rates), density-dependent mortality, resource production formulas, and pilgrimage dynamics. These additional mechanisms are required to generate annual population dynamics but are not derived from the formal model; they are documented in the code and their values are illustrative. Reproducing qualitative patterns is a necessary condition for the model not being broken, not a confirmation of its predictive accuracy. The simulation’s parameter values are illustrative rather than estimated; formal calibration against the annual-resolution Guiterman et al. (2015) timber dataset and independent quality proxies is the priority for the next stage.</w:t>
       </w:r>
     </w:p>
     <w:p>
@@ -6920,7 +6920,7 @@
         <w:t xml:space="preserve"> </w:t>
       </w:r>
       <w:r>
-        <w:t xml:space="preserve">Annual-resolution PMDI-construction correlation using 2,899 dated timber specimens from the Chaco Research Archive tree-ring database (25 sites, 828-1200 CE). (a) Annual timber cutting dates (bars) with 10-year moving sum (line). Construction peaks in the 1030s-1110s. (b) PMDI values (blue/cyan fill) and 30-year rolling variance (green line). (c) Scatter of PMDI variance vs. construction activity (20-year moving sums) colored by year. The correlation is negative (r = -0.15, p = 0.012), indicating that higher environmental variance is associated with less construction, inconsistent with the lambda-sigma prediction. PMDI level correlates positively with construction (r = +0.43, p &lt; 0.0001), consistent with the surplus model for construction timing.</w:t>
+        <w:t xml:space="preserve">Annual-resolution PMDI-construction correlation using 2,973 dated timber specimens from the Chaco Research Archive tree-ring database (24 sites, 800-1200 CE). (a) Annual timber cutting dates (bars) with 10-year moving sum (line). Construction peaks in the 1030s-1110s. (b) PMDI values (blue/cyan fill) and 30-year rolling variance (green line). (c) Scatter of PMDI variance vs. construction activity (20-year moving sums) colored by year. The correlation is negative (r = -0.15, p = 0.012), indicating that higher environmental variance is associated with less construction, inconsistent with the lambda-sigma prediction. PMDI level correlates positively with construction (r = +0.43, p &lt; 0.0001), consistent with the surplus model for construction timing.</w:t>
       </w:r>
     </w:p>
     <w:p>
@@ -6956,7 +6956,7 @@
         <w:t xml:space="preserve"> </w:t>
       </w:r>
       <w:r>
-        <w:t xml:space="preserve">Bayesian model comparison and parameter estimation. (a) LOO-CV model weights for three models predicting decadal construction from PMDI: signaling (variance), surplus (mean), and combined. All models are effectively equivalent at decadal resolution (elpd differences &lt; 1), indicating the decadal data cannot discriminate between mechanisms. (b) Posterior distribution for the Bayesian change-point in Chaco construction rate (Poisson model). The changepoint concentrates at AD 1082 (P(before 1130 megadrought) = 1.000), confirming pre-drought signal degradation. (c) Posterior for the quality-investment slope beta in a log-log regression of timber specimens on room counts across 13 sites. Mean beta = 1.67 (94% HDI: 0.84-2.45), P(beta &gt; 0) = 0.9998, confirming the Spence quality-investment gradient with superlinear scaling.</w:t>
+        <w:t xml:space="preserve">Bayesian model comparison and parameter estimation. (a) LOO-CV model weights for three models predicting decadal construction from PMDI: signaling (variance), surplus (mean), and combined. The three models are effectively equivalent in predictive accuracy (elpd differences &lt; 1), indicating the decadal data cannot discriminate between mechanisms at this temporal scale. LOO stacking assigns weight to one model, but this is an artifact of the algorithm when models are nearly identical in predictive performance. (b) Posterior distribution for the Bayesian change-point in Chaco construction rate (Poisson model). The changepoint concentrates at AD 1082 (P(before 1130 megadrought) = 1.000), confirming pre-drought signal degradation. (c) Posterior for the quality-investment slope beta in a log-log regression of timber specimens on room counts across 13 sites. Mean beta = 1.67 (94% HDI: 0.84-2.45), P(beta &gt; 0) = 0.9998, confirming the Spence quality-investment gradient with superlinear scaling.</w:t>
       </w:r>
     </w:p>
     <w:bookmarkEnd w:id="49"/>

</xml_diff>

<commit_message>
Strengthen P5 section with cutting-date robustness and site-level wet-building
- Cutting dates only (n=120): same result, stronger surplus signal (r=+0.465)
- Site-level: every great house built preferentially during wet years
  (PB mean PMDI 0.54, CK 0.56, PdA 0.42, PB 0.91, KK 0.75 vs overall 0.11)
- Result robust to all data subsets: period, annual, cutting-date, site-level
- Insurance analogy refined: buy insurance when you can afford premiums (wet years)
  but motivation comes from living in a risky environment
- Reformulation constraint specified: mechanism must explain why signaling
  concentrates in marginal environments while construction tracks moisture
</commit_message>
<xml_diff>
--- a/docs/manuscript/Chaco_Signaling_Manuscript.docx
+++ b/docs/manuscript/Chaco_Signaling_Manuscript.docx
@@ -3593,7 +3593,32 @@
         <w:t xml:space="preserve"> </w:t>
       </w:r>
       <w:r>
-        <w:t xml:space="preserve">construction, the opposite of what the lambda-sigma feedback predicts. PMDI level (mean wetness) correlates positively with construction across all temporal windows (20-year PMDI mean vs. 20-year construction sum: r = +0.386; 30-year PMDI mean vs. 20-year construction sum: r = +0.43), consistent with the surplus model’s prediction that wetter conditions enable more construction. The nominal p-values (p &lt; 0.01 for variance, p &lt; 0.0001 for mean) should be interpreted with caution: rolling-window statistics produce strongly autocorrelated series that inflate the effective degrees of freedom. The direction of the associations is robust, but the nominal significance levels overstate the precision of the estimates. The correlations indicate that construction timing tracks mean moisture, not environmental variance.</w:t>
+        <w:t xml:space="preserve">construction, the opposite of what the lambda-sigma feedback predicts. PMDI level (mean wetness) correlates positively with construction across all temporal windows (20-year PMDI mean vs. 20-year construction sum: r = +0.386; 30-year PMDI mean vs. 20-year construction sum: r = +0.43), consistent with the surplus model’s prediction that wetter conditions enable more construction. The nominal p-values (p &lt; 0.01 for variance, p &lt; 0.0001 for mean) should be interpreted with caution: rolling-window statistics produce strongly autocorrelated series that inflate the effective degrees of freedom. The direction of the associations is robust, but the nominal significance levels overstate the precision of the estimates.</w:t>
+      </w:r>
+    </w:p>
+    <w:p>
+      <w:pPr>
+        <w:pStyle w:val="BodyText"/>
+      </w:pPr>
+      <w:r>
+        <w:t xml:space="preserve">The result is robust to data quality filtering. Only 120 of the 2,973 specimens have definitive cutting dates (quality code</w:t>
+      </w:r>
+      <w:r>
+        <w:t xml:space="preserve"> </w:t>
+      </w:r>
+      <w:r>
+        <w:t xml:space="preserve">“c”</w:t>
+      </w:r>
+      <w:r>
+        <w:t xml:space="preserve">), the gold standard for construction timing. Restricting the analysis to these 120 specimens yields the same pattern: variance correlates negatively with construction (r = -0.135) and mean PMDI correlates positively and more strongly (r = +0.465). The result is not an artifact of imprecise dates.</w:t>
+      </w:r>
+    </w:p>
+    <w:p>
+      <w:pPr>
+        <w:pStyle w:val="BodyText"/>
+      </w:pPr>
+      <w:r>
+        <w:t xml:space="preserve">Site-level analysis reinforces the pattern. Every major great house built preferentially during wet years. Mean PMDI during active construction years was 0.54 for Pueblo Bonito, 0.56 for Chetro Ketl, 0.42 for Pueblo del Arroyo, 0.91 for Penasco Blanco, and 0.75 for Kin Kletso, compared to an overall mean of 0.11 across the 850-1150 CE period. This is not a statistical subtlety; it is a consistent, large effect visible at every site. People built when it was wet.</w:t>
       </w:r>
     </w:p>
     <w:p>
@@ -3611,15 +3636,23 @@
         <w:t xml:space="preserve"> </w:t>
       </w:r>
       <w:r>
-        <w:t xml:space="preserve">The lambda-sigma feedback is not supported at either period or annual resolution. At the annual scale, PMDI variance correlates negatively with construction activity, and PMDI level correlates positively, consistent with a surplus model and inconsistent with the signaling model’s distinctive mechanism. We report this result as a clear failure of the model’s most distinctive prediction. The lambda-sigma feedback, as currently formulated, does not account for the observed PMDI-construction relationship.</w:t>
-      </w:r>
-    </w:p>
-    <w:p>
-      <w:pPr>
-        <w:pStyle w:val="BodyText"/>
-      </w:pPr>
-      <w:r>
-        <w:t xml:space="preserve">This negative result does not invalidate the signaling model as a whole. The other discriminating predictions (P3: visibility, P4: conflict reduction, P8: collapse sequence) and the surplus-vs-signaling discrimination tests in Section 6.2 (pre-drought signal degradation, post-collapse non-recovery, competitive displacement) are supported by evidence that surplus models cannot accommodate. What the P5 result does indicate is that the specific mechanism linking environmental uncertainty to signaling returns requires revision. The motivation for signaling may not be PMDI variance per se but rather the structural properties of the environment, its marginality, the spatial heterogeneity of drought patterns across climate regimes (Gauthier 2021), and the multi-millennial context of Pueblo-period aridity (Polyak et al. 2022), that make cooperation networks valuable regardless of short-term variance. The insurance analogy in Section 3.4 may be more apt than the variance-tracking mechanism: communities in marginal environments purchase insurance (cooperation networks maintained through signaling) because they know shortfalls will come, not because they track year-to-year variance in real time. Reformulating the lambda-sigma mechanism to capture structural marginality rather than rolling variance is a priority for the next stage of the research programme.</w:t>
+        <w:t xml:space="preserve">The lambda-sigma feedback is not supported at any resolution: period-level, annual, cutting-date-only, or site-level. PMDI variance correlates negatively with construction, and PMDI level correlates positively, across all temporal windows and data subsets. We report this as a clear falsification of the model’s most distinctive prediction.</w:t>
+      </w:r>
+    </w:p>
+    <w:p>
+      <w:pPr>
+        <w:pStyle w:val="BodyText"/>
+      </w:pPr>
+      <w:r>
+        <w:t xml:space="preserve">This negative result does not invalidate the signaling model as a whole. The other discriminating predictions (P3: visibility, P4: conflict reduction, P8: collapse sequence) and the surplus-vs-signaling discrimination tests in Section 6.2 (pre-drought signal degradation, post-collapse non-recovery, competitive displacement) are supported by evidence that naive surplus models cannot accommodate. What the P5 result does indicate is that the specific mechanism linking environmental uncertainty to signaling returns requires revision.</w:t>
+      </w:r>
+    </w:p>
+    <w:p>
+      <w:pPr>
+        <w:pStyle w:val="BodyText"/>
+      </w:pPr>
+      <w:r>
+        <w:t xml:space="preserve">The site-level wet-building pattern is instructive for the reformulation. The insurance analogy in Section 3.4 may be more apt than the variance-tracking mechanism: communities in marginal environments purchase insurance (cooperation networks maintained through signaling) when they can afford the premiums (wet years), not when the disaster hits. The motivation for signaling is the structural properties of the environment, Chaco Canyon’s long-term aridity (Polyak et al. 2022), the spatial heterogeneity of drought patterns across climate regimes (Gauthier 2021), and the cumulative fragility of the local resource base (Lentz et al. 2021), that make cooperation networks valuable regardless of short-term variance. A reformulated Layer 3 should capture this structural vulnerability rather than rolling variance, and the construction-during-wet-years pattern provides a constraint: the mechanism must explain why signaling concentrates in marginal environments while construction within those environments tracks moisture availability.</w:t>
       </w:r>
     </w:p>
     <w:bookmarkEnd w:id="33"/>

</xml_diff>